<commit_message>
Cập nhật nhật ký thực tập tuần 3
</commit_message>
<xml_diff>
--- a/Nhật ký thực tập.docx
+++ b/Nhật ký thực tập.docx
@@ -449,7 +449,7 @@
                 <w:szCs w:val="26"/>
                 <w:rtl w:val="0"/>
               </w:rPr>
-              <w:t xml:space="preserve">Thành phố Hồ Chí Minh, ngày 13 tháng  07 năm 2026</w:t>
+              <w:t xml:space="preserve">Thành phố Hồ Chí Minh, ngày 13 tháng 07 năm 2026</w:t>
             </w:r>
             <w:r>
               <w:rPr>
@@ -1331,40 +1331,146 @@
           <w:p>
             <w:pPr>
               <w:spacing w:line="360" w:lineRule="auto"/>
-              <w:ind w:left="0" w:firstLine="0"/>
-              <w:jc w:val="both"/>
-              <w:rPr>
-                <w:rFonts w:ascii="Times New Roman" w:cs="Times New Roman" w:eastAsia="Times New Roman" w:hAnsi="Times New Roman"/>
-                <w:sz w:val="26"/>
-                <w:szCs w:val="26"/>
-              </w:rPr>
-            </w:pPr>
-            <w:r>
-              <w:rPr>
-                <w:rtl w:val="0"/>
-              </w:rPr>
-            </w:r>
-          </w:p>
-        </w:tc>
-        <w:tc>
-          <w:tcPr>
-            <w:vAlign w:val="center"/>
-          </w:tcPr>
-          <w:p>
-            <w:pPr>
-              <w:spacing w:line="360" w:lineRule="auto"/>
-              <w:ind w:left="0" w:firstLine="0"/>
-              <w:jc w:val="both"/>
-              <w:rPr>
-                <w:rFonts w:ascii="Times New Roman" w:cs="Times New Roman" w:eastAsia="Times New Roman" w:hAnsi="Times New Roman"/>
-                <w:sz w:val="26"/>
-                <w:szCs w:val="26"/>
-              </w:rPr>
-            </w:pPr>
-            <w:r>
-              <w:rPr>
-                <w:rtl w:val="0"/>
-              </w:rPr>
+              <w:jc w:val="both"/>
+              <w:rPr>
+                <w:rFonts w:ascii="Times New Roman" w:cs="Times New Roman" w:eastAsia="Times New Roman" w:hAnsi="Times New Roman"/>
+                <w:sz w:val="26"/>
+                <w:szCs w:val="26"/>
+              </w:rPr>
+            </w:pPr>
+            <w:r>
+              <w:rPr>
+                <w:rFonts w:ascii="Times New Roman" w:cs="Times New Roman" w:eastAsia="Times New Roman" w:hAnsi="Times New Roman"/>
+                <w:sz w:val="26"/>
+                <w:szCs w:val="26"/>
+                <w:rtl w:val="0"/>
+              </w:rPr>
+              <w:t xml:space="preserve">- Tìm hiểu quy trình nhập liệu và quản lý thông tin của nhà trường.</w:t>
+            </w:r>
+          </w:p>
+          <w:p>
+            <w:pPr>
+              <w:spacing w:line="360" w:lineRule="auto"/>
+              <w:jc w:val="both"/>
+              <w:rPr>
+                <w:rFonts w:ascii="Times New Roman" w:cs="Times New Roman" w:eastAsia="Times New Roman" w:hAnsi="Times New Roman"/>
+                <w:sz w:val="26"/>
+                <w:szCs w:val="26"/>
+              </w:rPr>
+            </w:pPr>
+            <w:r>
+              <w:rPr>
+                <w:rFonts w:ascii="Times New Roman" w:cs="Times New Roman" w:eastAsia="Times New Roman" w:hAnsi="Times New Roman"/>
+                <w:sz w:val="26"/>
+                <w:szCs w:val="26"/>
+                <w:rtl w:val="0"/>
+              </w:rPr>
+              <w:t xml:space="preserve">- Hỗ trợ nhập dữ liệu theo sự phân công.</w:t>
+            </w:r>
+          </w:p>
+          <w:p>
+            <w:pPr>
+              <w:spacing w:line="360" w:lineRule="auto"/>
+              <w:jc w:val="both"/>
+              <w:rPr>
+                <w:rFonts w:ascii="Times New Roman" w:cs="Times New Roman" w:eastAsia="Times New Roman" w:hAnsi="Times New Roman"/>
+                <w:sz w:val="26"/>
+                <w:szCs w:val="26"/>
+              </w:rPr>
+            </w:pPr>
+            <w:r>
+              <w:rPr>
+                <w:rFonts w:ascii="Times New Roman" w:cs="Times New Roman" w:eastAsia="Times New Roman" w:hAnsi="Times New Roman"/>
+                <w:sz w:val="26"/>
+                <w:szCs w:val="26"/>
+                <w:rtl w:val="0"/>
+              </w:rPr>
+              <w:t xml:space="preserve">- Kiểm tra, đối chiếu tính đầy đủ và chính xác của thông tin trước và sau khi nhập liệu.</w:t>
+            </w:r>
+          </w:p>
+          <w:p>
+            <w:pPr>
+              <w:spacing w:line="360" w:lineRule="auto"/>
+              <w:jc w:val="both"/>
+              <w:rPr>
+                <w:rFonts w:ascii="Times New Roman" w:cs="Times New Roman" w:eastAsia="Times New Roman" w:hAnsi="Times New Roman"/>
+                <w:sz w:val="26"/>
+                <w:szCs w:val="26"/>
+              </w:rPr>
+            </w:pPr>
+            <w:r>
+              <w:rPr>
+                <w:rFonts w:ascii="Times New Roman" w:cs="Times New Roman" w:eastAsia="Times New Roman" w:hAnsi="Times New Roman"/>
+                <w:sz w:val="26"/>
+                <w:szCs w:val="26"/>
+                <w:rtl w:val="0"/>
+              </w:rPr>
+              <w:t xml:space="preserve">- Quan sát quy trình cập nhật dữ liệu trên phần mềm quản lý và hỗ trợ một số công việc hành chính liên quan.</w:t>
+            </w:r>
+          </w:p>
+        </w:tc>
+        <w:tc>
+          <w:tcPr>
+            <w:vAlign w:val="center"/>
+          </w:tcPr>
+          <w:p>
+            <w:pPr>
+              <w:spacing w:line="360" w:lineRule="auto"/>
+              <w:jc w:val="both"/>
+              <w:rPr>
+                <w:rFonts w:ascii="Times New Roman" w:cs="Times New Roman" w:eastAsia="Times New Roman" w:hAnsi="Times New Roman"/>
+                <w:sz w:val="26"/>
+                <w:szCs w:val="26"/>
+              </w:rPr>
+            </w:pPr>
+            <w:r>
+              <w:rPr>
+                <w:rFonts w:ascii="Times New Roman" w:cs="Times New Roman" w:eastAsia="Times New Roman" w:hAnsi="Times New Roman"/>
+                <w:sz w:val="26"/>
+                <w:szCs w:val="26"/>
+                <w:rtl w:val="0"/>
+              </w:rPr>
+              <w:t xml:space="preserve">- Hoàn thành công việc nhập liệu được giao, bảo đảm dữ liệu đầy đủ và chính xác.</w:t>
+            </w:r>
+          </w:p>
+          <w:p>
+            <w:pPr>
+              <w:spacing w:line="360" w:lineRule="auto"/>
+              <w:jc w:val="both"/>
+              <w:rPr>
+                <w:rFonts w:ascii="Times New Roman" w:cs="Times New Roman" w:eastAsia="Times New Roman" w:hAnsi="Times New Roman"/>
+                <w:sz w:val="26"/>
+                <w:szCs w:val="26"/>
+              </w:rPr>
+            </w:pPr>
+            <w:r>
+              <w:rPr>
+                <w:rFonts w:ascii="Times New Roman" w:cs="Times New Roman" w:eastAsia="Times New Roman" w:hAnsi="Times New Roman"/>
+                <w:sz w:val="26"/>
+                <w:szCs w:val="26"/>
+                <w:rtl w:val="0"/>
+              </w:rPr>
+              <w:t xml:space="preserve">Hiểu quy trình nhập liệu, cập nhật và quản lý thông tin tại đơn vị thực tập.</w:t>
+            </w:r>
+          </w:p>
+          <w:p>
+            <w:pPr>
+              <w:spacing w:line="360" w:lineRule="auto"/>
+              <w:jc w:val="both"/>
+              <w:rPr>
+                <w:rFonts w:ascii="Times New Roman" w:cs="Times New Roman" w:eastAsia="Times New Roman" w:hAnsi="Times New Roman"/>
+                <w:sz w:val="26"/>
+                <w:szCs w:val="26"/>
+              </w:rPr>
+            </w:pPr>
+            <w:r>
+              <w:rPr>
+                <w:rFonts w:ascii="Times New Roman" w:cs="Times New Roman" w:eastAsia="Times New Roman" w:hAnsi="Times New Roman"/>
+                <w:sz w:val="26"/>
+                <w:szCs w:val="26"/>
+                <w:rtl w:val="0"/>
+              </w:rPr>
+              <w:t xml:space="preserve">Làm quen với phần mềm quản lý và quy trình xử lý dữ liệu của nhà trường.</w:t>
             </w:r>
           </w:p>
         </w:tc>

</xml_diff>

<commit_message>
Báo cáo thực tập tuần 5
</commit_message>
<xml_diff>
--- a/Nhật ký thực tập.docx
+++ b/Nhật ký thực tập.docx
@@ -1868,8 +1868,112 @@
             </w:pPr>
             <w:r>
               <w:rPr>
-                <w:rtl w:val="0"/>
-              </w:rPr>
+                <w:rFonts w:ascii="Times New Roman" w:cs="Times New Roman" w:eastAsia="Times New Roman" w:hAnsi="Times New Roman"/>
+                <w:sz w:val="26"/>
+                <w:szCs w:val="26"/>
+                <w:rtl w:val="0"/>
+              </w:rPr>
+              <w:t xml:space="preserve">- Tiếp tục hỗ trợ nhập liệu và cập nhật thông tin học sinh theo sự phân công.</w:t>
+            </w:r>
+          </w:p>
+          <w:p>
+            <w:pPr>
+              <w:spacing w:line="432" w:lineRule="auto"/>
+              <w:jc w:val="both"/>
+              <w:rPr>
+                <w:rFonts w:ascii="Times New Roman" w:cs="Times New Roman" w:eastAsia="Times New Roman" w:hAnsi="Times New Roman"/>
+                <w:sz w:val="26"/>
+                <w:szCs w:val="26"/>
+              </w:rPr>
+            </w:pPr>
+            <w:r>
+              <w:rPr>
+                <w:rFonts w:ascii="Times New Roman" w:cs="Times New Roman" w:eastAsia="Times New Roman" w:hAnsi="Times New Roman"/>
+                <w:sz w:val="26"/>
+                <w:szCs w:val="26"/>
+                <w:rtl w:val="0"/>
+              </w:rPr>
+              <w:t xml:space="preserve">- Kiểm tra, rà soát các trường thông tin trong danh sách học sinh như mã định danh, họ tên, ngày sinh, giới tính, dân tộc và trạng thái học sinh.</w:t>
+            </w:r>
+          </w:p>
+          <w:p>
+            <w:pPr>
+              <w:spacing w:line="432" w:lineRule="auto"/>
+              <w:jc w:val="both"/>
+              <w:rPr>
+                <w:rFonts w:ascii="Times New Roman" w:cs="Times New Roman" w:eastAsia="Times New Roman" w:hAnsi="Times New Roman"/>
+                <w:sz w:val="26"/>
+                <w:szCs w:val="26"/>
+              </w:rPr>
+            </w:pPr>
+            <w:r>
+              <w:rPr>
+                <w:rFonts w:ascii="Times New Roman" w:cs="Times New Roman" w:eastAsia="Times New Roman" w:hAnsi="Times New Roman"/>
+                <w:sz w:val="26"/>
+                <w:szCs w:val="26"/>
+                <w:rtl w:val="0"/>
+              </w:rPr>
+              <w:t xml:space="preserve">- Đối chiếu thông tin giữa hồ sơ được cung cấp và dữ liệu điện tử nhằm phát hiện các thông tin chưa đầy đủ hoặc chưa thống nhất.</w:t>
+            </w:r>
+          </w:p>
+          <w:p>
+            <w:pPr>
+              <w:spacing w:line="432" w:lineRule="auto"/>
+              <w:jc w:val="both"/>
+              <w:rPr>
+                <w:rFonts w:ascii="Times New Roman" w:cs="Times New Roman" w:eastAsia="Times New Roman" w:hAnsi="Times New Roman"/>
+                <w:sz w:val="26"/>
+                <w:szCs w:val="26"/>
+              </w:rPr>
+            </w:pPr>
+            <w:r>
+              <w:rPr>
+                <w:rFonts w:ascii="Times New Roman" w:cs="Times New Roman" w:eastAsia="Times New Roman" w:hAnsi="Times New Roman"/>
+                <w:sz w:val="26"/>
+                <w:szCs w:val="26"/>
+                <w:rtl w:val="0"/>
+              </w:rPr>
+              <w:t xml:space="preserve">- Kiểm tra định dạng và tính đầy đủ của dữ liệu trước khi sử dụng cho công tác thống kê, tổng hợp.</w:t>
+            </w:r>
+          </w:p>
+          <w:p>
+            <w:pPr>
+              <w:spacing w:line="432" w:lineRule="auto"/>
+              <w:jc w:val="both"/>
+              <w:rPr>
+                <w:rFonts w:ascii="Times New Roman" w:cs="Times New Roman" w:eastAsia="Times New Roman" w:hAnsi="Times New Roman"/>
+                <w:sz w:val="26"/>
+                <w:szCs w:val="26"/>
+              </w:rPr>
+            </w:pPr>
+            <w:r>
+              <w:rPr>
+                <w:rFonts w:ascii="Times New Roman" w:cs="Times New Roman" w:eastAsia="Times New Roman" w:hAnsi="Times New Roman"/>
+                <w:sz w:val="26"/>
+                <w:szCs w:val="26"/>
+                <w:rtl w:val="0"/>
+              </w:rPr>
+              <w:t xml:space="preserve">- Hỗ trợ sắp xếp, phân loại và lưu trữ hồ sơ học sinh theo quy định.</w:t>
+            </w:r>
+          </w:p>
+          <w:p>
+            <w:pPr>
+              <w:spacing w:line="432" w:lineRule="auto"/>
+              <w:jc w:val="both"/>
+              <w:rPr>
+                <w:rFonts w:ascii="Times New Roman" w:cs="Times New Roman" w:eastAsia="Times New Roman" w:hAnsi="Times New Roman"/>
+                <w:sz w:val="26"/>
+                <w:szCs w:val="26"/>
+              </w:rPr>
+            </w:pPr>
+            <w:r>
+              <w:rPr>
+                <w:rFonts w:ascii="Times New Roman" w:cs="Times New Roman" w:eastAsia="Times New Roman" w:hAnsi="Times New Roman"/>
+                <w:sz w:val="26"/>
+                <w:szCs w:val="26"/>
+                <w:rtl w:val="0"/>
+              </w:rPr>
+              <w:t xml:space="preserve">- Thực hiện một số công việc hành chính khác theo sự phân công của cán bộ hướng dẫn.</w:t>
             </w:r>
           </w:p>
         </w:tc>
@@ -1901,8 +2005,92 @@
             </w:pPr>
             <w:r>
               <w:rPr>
-                <w:rtl w:val="0"/>
-              </w:rPr>
+                <w:rFonts w:ascii="Times New Roman" w:cs="Times New Roman" w:eastAsia="Times New Roman" w:hAnsi="Times New Roman"/>
+                <w:sz w:val="26"/>
+                <w:szCs w:val="26"/>
+                <w:rtl w:val="0"/>
+              </w:rPr>
+              <w:t xml:space="preserve">- Hoàn thành việc nhập liệu và cập nhật các thông tin học sinh được phân công.</w:t>
+            </w:r>
+          </w:p>
+          <w:p>
+            <w:pPr>
+              <w:spacing w:line="432" w:lineRule="auto"/>
+              <w:jc w:val="both"/>
+              <w:rPr>
+                <w:rFonts w:ascii="Times New Roman" w:cs="Times New Roman" w:eastAsia="Times New Roman" w:hAnsi="Times New Roman"/>
+                <w:sz w:val="26"/>
+                <w:szCs w:val="26"/>
+              </w:rPr>
+            </w:pPr>
+            <w:r>
+              <w:rPr>
+                <w:rFonts w:ascii="Times New Roman" w:cs="Times New Roman" w:eastAsia="Times New Roman" w:hAnsi="Times New Roman"/>
+                <w:sz w:val="26"/>
+                <w:szCs w:val="26"/>
+                <w:rtl w:val="0"/>
+              </w:rPr>
+              <w:t xml:space="preserve">- Biết cách kiểm tra và đối chiếu các trường thông tin trong dữ liệu học sinh.</w:t>
+            </w:r>
+          </w:p>
+          <w:p>
+            <w:pPr>
+              <w:spacing w:line="432" w:lineRule="auto"/>
+              <w:jc w:val="both"/>
+              <w:rPr>
+                <w:rFonts w:ascii="Times New Roman" w:cs="Times New Roman" w:eastAsia="Times New Roman" w:hAnsi="Times New Roman"/>
+                <w:sz w:val="26"/>
+                <w:szCs w:val="26"/>
+              </w:rPr>
+            </w:pPr>
+            <w:r>
+              <w:rPr>
+                <w:rFonts w:ascii="Times New Roman" w:cs="Times New Roman" w:eastAsia="Times New Roman" w:hAnsi="Times New Roman"/>
+                <w:sz w:val="26"/>
+                <w:szCs w:val="26"/>
+                <w:rtl w:val="0"/>
+              </w:rPr>
+              <w:t xml:space="preserve">- Phát hiện và ghi nhận một số trường dữ liệu chưa có thông tin hoặc cần được kiểm tra, bổ sung.</w:t>
+            </w:r>
+          </w:p>
+          <w:p>
+            <w:pPr>
+              <w:spacing w:line="432" w:lineRule="auto"/>
+              <w:jc w:val="both"/>
+              <w:rPr>
+                <w:rFonts w:ascii="Times New Roman" w:cs="Times New Roman" w:eastAsia="Times New Roman" w:hAnsi="Times New Roman"/>
+                <w:sz w:val="26"/>
+                <w:szCs w:val="26"/>
+              </w:rPr>
+            </w:pPr>
+            <w:r>
+              <w:rPr>
+                <w:rFonts w:ascii="Times New Roman" w:cs="Times New Roman" w:eastAsia="Times New Roman" w:hAnsi="Times New Roman"/>
+                <w:sz w:val="26"/>
+                <w:szCs w:val="26"/>
+                <w:rtl w:val="0"/>
+              </w:rPr>
+              <w:t xml:space="preserve">- Nắm được các yêu cầu cơ bản về tính đầy đủ, chính xác và thống nhất của dữ liệu trước khi thực hiện thống kê.</w:t>
+            </w:r>
+          </w:p>
+          <w:p>
+            <w:pPr>
+              <w:spacing w:line="432" w:lineRule="auto"/>
+              <w:jc w:val="both"/>
+              <w:rPr>
+                <w:rFonts w:ascii="Times New Roman" w:cs="Times New Roman" w:eastAsia="Times New Roman" w:hAnsi="Times New Roman"/>
+                <w:sz w:val="26"/>
+                <w:szCs w:val="26"/>
+              </w:rPr>
+            </w:pPr>
+            <w:r>
+              <w:rPr>
+                <w:rFonts w:ascii="Times New Roman" w:cs="Times New Roman" w:eastAsia="Times New Roman" w:hAnsi="Times New Roman"/>
+                <w:sz w:val="26"/>
+                <w:szCs w:val="26"/>
+                <w:rtl w:val="0"/>
+              </w:rPr>
+              <w:t xml:space="preserve">- Cải thiện kỹ năng xử lý dữ liệu bảng và kỹ năng kiểm tra, đối chiếu thông tin.</w:t>
             </w:r>
           </w:p>
         </w:tc>

</xml_diff>

<commit_message>
Báo cáo thực tập tuần 6
</commit_message>
<xml_diff>
--- a/Nhật ký thực tập.docx
+++ b/Nhật ký thực tập.docx
@@ -2198,8 +2198,52 @@
             </w:pPr>
             <w:r>
               <w:rPr>
-                <w:rtl w:val="0"/>
-              </w:rPr>
+                <w:rFonts w:ascii="Times New Roman" w:cs="Times New Roman" w:eastAsia="Times New Roman" w:hAnsi="Times New Roman"/>
+                <w:sz w:val="26"/>
+                <w:szCs w:val="26"/>
+                <w:rtl w:val="0"/>
+              </w:rPr>
+              <w:t xml:space="preserve">- Hỗ trợ kiểm kê và rà soát hồ sơ học sinh theo sự phân công.</w:t>
+            </w:r>
+          </w:p>
+          <w:p>
+            <w:pPr>
+              <w:spacing w:line="432" w:lineRule="auto"/>
+              <w:jc w:val="both"/>
+              <w:rPr>
+                <w:rFonts w:ascii="Times New Roman" w:cs="Times New Roman" w:eastAsia="Times New Roman" w:hAnsi="Times New Roman"/>
+                <w:sz w:val="26"/>
+                <w:szCs w:val="26"/>
+              </w:rPr>
+            </w:pPr>
+            <w:r>
+              <w:rPr>
+                <w:rFonts w:ascii="Times New Roman" w:cs="Times New Roman" w:eastAsia="Times New Roman" w:hAnsi="Times New Roman"/>
+                <w:sz w:val="26"/>
+                <w:szCs w:val="26"/>
+                <w:rtl w:val="0"/>
+              </w:rPr>
+              <w:t xml:space="preserve">- Đối chiếu thông tin học sinh giữa hồ sơ giấy và dữ liệu điện tử.</w:t>
+            </w:r>
+          </w:p>
+          <w:p>
+            <w:pPr>
+              <w:spacing w:line="432" w:lineRule="auto"/>
+              <w:jc w:val="both"/>
+              <w:rPr>
+                <w:rFonts w:ascii="Times New Roman" w:cs="Times New Roman" w:eastAsia="Times New Roman" w:hAnsi="Times New Roman"/>
+                <w:sz w:val="26"/>
+                <w:szCs w:val="26"/>
+              </w:rPr>
+            </w:pPr>
+            <w:r>
+              <w:rPr>
+                <w:rFonts w:ascii="Times New Roman" w:cs="Times New Roman" w:eastAsia="Times New Roman" w:hAnsi="Times New Roman"/>
+                <w:sz w:val="26"/>
+                <w:szCs w:val="26"/>
+                <w:rtl w:val="0"/>
+              </w:rPr>
+              <w:t xml:space="preserve">- Kiểm tra các thông tin còn thiếu, sai lệch hoặc chưa thống nhất và báo cáo lại với người phụ trách. </w:t>
             </w:r>
           </w:p>
         </w:tc>
@@ -2231,8 +2275,52 @@
             </w:pPr>
             <w:r>
               <w:rPr>
-                <w:rtl w:val="0"/>
-              </w:rPr>
+                <w:rFonts w:ascii="Times New Roman" w:cs="Times New Roman" w:eastAsia="Times New Roman" w:hAnsi="Times New Roman"/>
+                <w:sz w:val="26"/>
+                <w:szCs w:val="26"/>
+                <w:rtl w:val="0"/>
+              </w:rPr>
+              <w:t xml:space="preserve">- Hoàn thành việc kiểm tra, đối chiếu và cập nhật thông tin học sinh .</w:t>
+            </w:r>
+          </w:p>
+          <w:p>
+            <w:pPr>
+              <w:spacing w:line="432" w:lineRule="auto"/>
+              <w:jc w:val="both"/>
+              <w:rPr>
+                <w:rFonts w:ascii="Times New Roman" w:cs="Times New Roman" w:eastAsia="Times New Roman" w:hAnsi="Times New Roman"/>
+                <w:sz w:val="26"/>
+                <w:szCs w:val="26"/>
+              </w:rPr>
+            </w:pPr>
+            <w:r>
+              <w:rPr>
+                <w:rFonts w:ascii="Times New Roman" w:cs="Times New Roman" w:eastAsia="Times New Roman" w:hAnsi="Times New Roman"/>
+                <w:sz w:val="26"/>
+                <w:szCs w:val="26"/>
+                <w:rtl w:val="0"/>
+              </w:rPr>
+              <w:t xml:space="preserve">- Dữ liệu được cập nhật đầy đủ và chính xác.</w:t>
+            </w:r>
+          </w:p>
+          <w:p>
+            <w:pPr>
+              <w:spacing w:line="432" w:lineRule="auto"/>
+              <w:jc w:val="both"/>
+              <w:rPr>
+                <w:rFonts w:ascii="Times New Roman" w:cs="Times New Roman" w:eastAsia="Times New Roman" w:hAnsi="Times New Roman"/>
+                <w:sz w:val="26"/>
+                <w:szCs w:val="26"/>
+              </w:rPr>
+            </w:pPr>
+            <w:r>
+              <w:rPr>
+                <w:rFonts w:ascii="Times New Roman" w:cs="Times New Roman" w:eastAsia="Times New Roman" w:hAnsi="Times New Roman"/>
+                <w:sz w:val="26"/>
+                <w:szCs w:val="26"/>
+                <w:rtl w:val="0"/>
+              </w:rPr>
+              <w:t xml:space="preserve">- Hiểu quy trình quản lý hồ sơ học sinh tại đơn vị. </w:t>
             </w:r>
           </w:p>
         </w:tc>

</xml_diff>

<commit_message>
Báo cáo thực tập tuần 9
</commit_message>
<xml_diff>
--- a/Nhật ký thực tập.docx
+++ b/Nhật ký thực tập.docx
@@ -145,7 +145,7 @@
                     </wp:anchor>
                   </w:drawing>
                 </mc:Choice>
-                <mc:Fallback xmlns:sl="http://schemas.openxmlformats.org/schemaLibrary/2006/main" xmlns:a="http://schemas.openxmlformats.org/drawingml/2006/main" xmlns:pic="http://schemas.openxmlformats.org/drawingml/2006/picture" xmlns:c="http://schemas.openxmlformats.org/drawingml/2006/chart" xmlns:lc="http://schemas.openxmlformats.org/drawingml/2006/lockedCanvas" xmlns:dgm="http://schemas.openxmlformats.org/drawingml/2006/diagram" xmlns="http://schemas.microsoft.com/office/tasks/2019/documenttasks" xmlns:cr="http://schemas.microsoft.com/office/comments/2020/reactions">
+                <mc:Fallback xmlns:cr="http://schemas.microsoft.com/office/comments/2020/reactions" xmlns="http://schemas.microsoft.com/office/tasks/2019/documenttasks" xmlns:dgm="http://schemas.openxmlformats.org/drawingml/2006/diagram" xmlns:lc="http://schemas.openxmlformats.org/drawingml/2006/lockedCanvas" xmlns:c="http://schemas.openxmlformats.org/drawingml/2006/chart" xmlns:pic="http://schemas.openxmlformats.org/drawingml/2006/picture" xmlns:a="http://schemas.openxmlformats.org/drawingml/2006/main" xmlns:sl="http://schemas.openxmlformats.org/schemaLibrary/2006/main">
                   <w:drawing>
                     <wp:anchor allowOverlap="1" behindDoc="0" distB="4294967295" distT="4294967295" distL="114300" distR="114300" hidden="0" layoutInCell="1" locked="0" relativeHeight="0" simplePos="0">
                       <wp:simplePos x="0" y="0"/>
@@ -314,7 +314,7 @@
                     </wp:anchor>
                   </w:drawing>
                 </mc:Choice>
-                <mc:Fallback xmlns:sl="http://schemas.openxmlformats.org/schemaLibrary/2006/main" xmlns:a="http://schemas.openxmlformats.org/drawingml/2006/main" xmlns:pic="http://schemas.openxmlformats.org/drawingml/2006/picture" xmlns:c="http://schemas.openxmlformats.org/drawingml/2006/chart" xmlns:lc="http://schemas.openxmlformats.org/drawingml/2006/lockedCanvas" xmlns:dgm="http://schemas.openxmlformats.org/drawingml/2006/diagram" xmlns="http://schemas.microsoft.com/office/tasks/2019/documenttasks" xmlns:cr="http://schemas.microsoft.com/office/comments/2020/reactions">
+                <mc:Fallback xmlns:cr="http://schemas.microsoft.com/office/comments/2020/reactions" xmlns="http://schemas.microsoft.com/office/tasks/2019/documenttasks" xmlns:dgm="http://schemas.openxmlformats.org/drawingml/2006/diagram" xmlns:lc="http://schemas.openxmlformats.org/drawingml/2006/lockedCanvas" xmlns:c="http://schemas.openxmlformats.org/drawingml/2006/chart" xmlns:pic="http://schemas.openxmlformats.org/drawingml/2006/picture" xmlns:a="http://schemas.openxmlformats.org/drawingml/2006/main" xmlns:sl="http://schemas.openxmlformats.org/schemaLibrary/2006/main">
                   <w:drawing>
                     <wp:anchor allowOverlap="1" behindDoc="0" distB="4294967295" distT="4294967295" distL="114300" distR="114300" hidden="0" layoutInCell="1" locked="0" relativeHeight="0" simplePos="0">
                       <wp:simplePos x="0" y="0"/>
@@ -2622,96 +2622,64 @@
                 <w:sz w:val="26"/>
                 <w:szCs w:val="26"/>
               </w:rPr>
-              <w:t xml:space="preserve">- </w:t>
-            </w:r>
-            <w:r>
-              <w:rPr>
-                <w:rFonts w:ascii="Times New Roman" w:eastAsia="Times New Roman" w:hAnsi="Times New Roman" w:cs="Times New Roman"/>
-                <w:sz w:val="26"/>
-                <w:szCs w:val="26"/>
-              </w:rPr>
-              <w:t>Phân loại dữ liệu theo một số tiêu chí như năm học, khối lớp và giới tính.</w:t>
-            </w:r>
-          </w:p>
-          <w:p>
-            <w:pPr>
-              <w:spacing w:line="432" w:lineRule="auto"/>
-              <w:jc w:val="both"/>
-              <w:rPr>
-                <w:rFonts w:ascii="Times New Roman" w:eastAsia="Times New Roman" w:hAnsi="Times New Roman" w:cs="Times New Roman"/>
-                <w:sz w:val="26"/>
-                <w:szCs w:val="26"/>
-              </w:rPr>
-            </w:pPr>
-            <w:r>
-              <w:rPr>
-                <w:rFonts w:ascii="Times New Roman" w:eastAsia="Times New Roman" w:hAnsi="Times New Roman" w:cs="Times New Roman"/>
-                <w:sz w:val="26"/>
-                <w:szCs w:val="26"/>
-              </w:rPr>
-              <w:t xml:space="preserve">- </w:t>
-            </w:r>
-            <w:r>
-              <w:rPr>
-                <w:rFonts w:ascii="Times New Roman" w:eastAsia="Times New Roman" w:hAnsi="Times New Roman" w:cs="Times New Roman"/>
-                <w:sz w:val="26"/>
-                <w:szCs w:val="26"/>
-              </w:rPr>
-              <w:t>Thực hiện thống kê số lượng học sinh phục vụ cho việc tổng hợp và phân tích dữ liệu.</w:t>
-            </w:r>
-          </w:p>
-          <w:p>
-            <w:pPr>
-              <w:spacing w:line="432" w:lineRule="auto"/>
-              <w:jc w:val="both"/>
-              <w:rPr>
-                <w:rFonts w:ascii="Times New Roman" w:eastAsia="Times New Roman" w:hAnsi="Times New Roman" w:cs="Times New Roman"/>
-                <w:sz w:val="26"/>
-                <w:szCs w:val="26"/>
-              </w:rPr>
-            </w:pPr>
-            <w:r>
-              <w:rPr>
-                <w:rFonts w:ascii="Times New Roman" w:eastAsia="Times New Roman" w:hAnsi="Times New Roman" w:cs="Times New Roman"/>
-                <w:sz w:val="26"/>
-                <w:szCs w:val="26"/>
-              </w:rPr>
-              <w:t xml:space="preserve">- </w:t>
-            </w:r>
-            <w:r>
-              <w:rPr>
-                <w:rFonts w:ascii="Times New Roman" w:eastAsia="Times New Roman" w:hAnsi="Times New Roman" w:cs="Times New Roman"/>
-                <w:sz w:val="26"/>
-                <w:szCs w:val="26"/>
-              </w:rPr>
-              <w:t>Kiểm tra kết quả thống kê, đối chiếu với dữ liệu ban đầu nhằm đảm bảo tính chính xác.</w:t>
-            </w:r>
-          </w:p>
-          <w:p>
-            <w:pPr>
-              <w:spacing w:line="432" w:lineRule="auto"/>
-              <w:jc w:val="both"/>
-              <w:rPr>
-                <w:rFonts w:ascii="Times New Roman" w:eastAsia="Times New Roman" w:hAnsi="Times New Roman" w:cs="Times New Roman"/>
-                <w:sz w:val="26"/>
-                <w:szCs w:val="26"/>
-              </w:rPr>
-            </w:pPr>
-            <w:r>
-              <w:rPr>
-                <w:rFonts w:ascii="Times New Roman" w:eastAsia="Times New Roman" w:hAnsi="Times New Roman" w:cs="Times New Roman"/>
-                <w:sz w:val="26"/>
-                <w:szCs w:val="26"/>
-              </w:rPr>
-              <w:t xml:space="preserve">- </w:t>
-            </w:r>
-            <w:r>
-              <w:rPr>
-                <w:rFonts w:ascii="Times New Roman" w:eastAsia="Times New Roman" w:hAnsi="Times New Roman" w:cs="Times New Roman"/>
-                <w:sz w:val="26"/>
-                <w:szCs w:val="26"/>
-              </w:rPr>
-              <w:t xml:space="preserve">Tiếp tục thực hiện các nội dung phân </w:t>
+              <w:t>- Phân loại dữ liệu theo một số tiêu chí như năm học, khối lớp và giới tính.</w:t>
+            </w:r>
+          </w:p>
+          <w:p>
+            <w:pPr>
+              <w:spacing w:line="432" w:lineRule="auto"/>
+              <w:jc w:val="both"/>
+              <w:rPr>
+                <w:rFonts w:ascii="Times New Roman" w:eastAsia="Times New Roman" w:hAnsi="Times New Roman" w:cs="Times New Roman"/>
+                <w:sz w:val="26"/>
+                <w:szCs w:val="26"/>
+              </w:rPr>
+            </w:pPr>
+            <w:r>
+              <w:rPr>
+                <w:rFonts w:ascii="Times New Roman" w:eastAsia="Times New Roman" w:hAnsi="Times New Roman" w:cs="Times New Roman"/>
+                <w:sz w:val="26"/>
+                <w:szCs w:val="26"/>
+              </w:rPr>
+              <w:t>- Thực hiện thống kê số lượng học sinh phục vụ cho việc tổng hợp và phân tích dữ liệu.</w:t>
+            </w:r>
+          </w:p>
+          <w:p>
+            <w:pPr>
+              <w:spacing w:line="432" w:lineRule="auto"/>
+              <w:jc w:val="both"/>
+              <w:rPr>
+                <w:rFonts w:ascii="Times New Roman" w:eastAsia="Times New Roman" w:hAnsi="Times New Roman" w:cs="Times New Roman"/>
+                <w:sz w:val="26"/>
+                <w:szCs w:val="26"/>
+              </w:rPr>
+            </w:pPr>
+            <w:r>
+              <w:rPr>
+                <w:rFonts w:ascii="Times New Roman" w:eastAsia="Times New Roman" w:hAnsi="Times New Roman" w:cs="Times New Roman"/>
+                <w:sz w:val="26"/>
+                <w:szCs w:val="26"/>
+              </w:rPr>
+              <w:t>- Kiểm tra kết quả thống kê, đối chiếu với dữ liệu ban đầu nhằm đảm bảo tính chính xác.</w:t>
+            </w:r>
+          </w:p>
+          <w:p>
+            <w:pPr>
+              <w:spacing w:line="432" w:lineRule="auto"/>
+              <w:jc w:val="both"/>
+              <w:rPr>
+                <w:rFonts w:ascii="Times New Roman" w:eastAsia="Times New Roman" w:hAnsi="Times New Roman" w:cs="Times New Roman"/>
+                <w:sz w:val="26"/>
+                <w:szCs w:val="26"/>
+              </w:rPr>
+            </w:pPr>
+            <w:r>
+              <w:rPr>
+                <w:rFonts w:ascii="Times New Roman" w:eastAsia="Times New Roman" w:hAnsi="Times New Roman" w:cs="Times New Roman"/>
+                <w:sz w:val="26"/>
+                <w:szCs w:val="26"/>
+              </w:rPr>
+              <w:t xml:space="preserve">- Tiếp tục thực hiện các nội dung phân </w:t>
             </w:r>
             <w:r>
               <w:rPr>
@@ -2727,23 +2695,7 @@
                 <w:sz w:val="26"/>
                 <w:szCs w:val="26"/>
               </w:rPr>
-              <w:t xml:space="preserve">phục vụ </w:t>
-            </w:r>
-            <w:r>
-              <w:rPr>
-                <w:rFonts w:ascii="Times New Roman" w:eastAsia="Times New Roman" w:hAnsi="Times New Roman" w:cs="Times New Roman"/>
-                <w:sz w:val="26"/>
-                <w:szCs w:val="26"/>
-              </w:rPr>
-              <w:t>đề tài</w:t>
-            </w:r>
-            <w:r>
-              <w:rPr>
-                <w:rFonts w:ascii="Times New Roman" w:eastAsia="Times New Roman" w:hAnsi="Times New Roman" w:cs="Times New Roman"/>
-                <w:sz w:val="26"/>
-                <w:szCs w:val="26"/>
-              </w:rPr>
-              <w:t xml:space="preserve"> thực tập.</w:t>
+              <w:t>phục vụ đề tài thực tập.</w:t>
             </w:r>
           </w:p>
         </w:tc>
@@ -2800,7 +2752,6 @@
                 <w:rFonts w:ascii="Times New Roman" w:eastAsia="Times New Roman" w:hAnsi="Times New Roman" w:cs="Times New Roman"/>
                 <w:sz w:val="26"/>
                 <w:szCs w:val="26"/>
-                <w:lang w:val="en-US"/>
               </w:rPr>
             </w:pPr>
             <w:r>
@@ -2836,42 +2787,26 @@
                 <w:sz w:val="26"/>
                 <w:szCs w:val="26"/>
               </w:rPr>
-              <w:t xml:space="preserve">- </w:t>
-            </w:r>
-            <w:r>
-              <w:rPr>
-                <w:rFonts w:ascii="Times New Roman" w:eastAsia="Times New Roman" w:hAnsi="Times New Roman" w:cs="Times New Roman"/>
-                <w:sz w:val="26"/>
-                <w:szCs w:val="26"/>
-              </w:rPr>
-              <w:t>Hoàn thành bước xử lý dữ liệu phục vụ cho việc phân tích trong báo cáo thực tập.</w:t>
-            </w:r>
-          </w:p>
-          <w:p>
-            <w:pPr>
-              <w:spacing w:line="432" w:lineRule="auto"/>
-              <w:jc w:val="both"/>
-              <w:rPr>
-                <w:rFonts w:ascii="Times New Roman" w:eastAsia="Times New Roman" w:hAnsi="Times New Roman" w:cs="Times New Roman"/>
-                <w:sz w:val="26"/>
-                <w:szCs w:val="26"/>
-              </w:rPr>
-            </w:pPr>
-            <w:r>
-              <w:rPr>
-                <w:rFonts w:ascii="Times New Roman" w:eastAsia="Times New Roman" w:hAnsi="Times New Roman" w:cs="Times New Roman"/>
-                <w:sz w:val="26"/>
-                <w:szCs w:val="26"/>
-              </w:rPr>
-              <w:t xml:space="preserve">- </w:t>
-            </w:r>
-            <w:r>
-              <w:rPr>
-                <w:rFonts w:ascii="Times New Roman" w:eastAsia="Times New Roman" w:hAnsi="Times New Roman" w:cs="Times New Roman"/>
-                <w:sz w:val="26"/>
-                <w:szCs w:val="26"/>
-              </w:rPr>
-              <w:t>Kết quả thống kê được kiểm tra và đối chiếu với dữ liệu ban đầu.</w:t>
+              <w:t>- Hoàn thành bước xử lý dữ liệu phục vụ cho việc phân tích trong báo cáo thực tập.</w:t>
+            </w:r>
+          </w:p>
+          <w:p>
+            <w:pPr>
+              <w:spacing w:line="432" w:lineRule="auto"/>
+              <w:jc w:val="both"/>
+              <w:rPr>
+                <w:rFonts w:ascii="Times New Roman" w:eastAsia="Times New Roman" w:hAnsi="Times New Roman" w:cs="Times New Roman"/>
+                <w:sz w:val="26"/>
+                <w:szCs w:val="26"/>
+              </w:rPr>
+            </w:pPr>
+            <w:r>
+              <w:rPr>
+                <w:rFonts w:ascii="Times New Roman" w:eastAsia="Times New Roman" w:hAnsi="Times New Roman" w:cs="Times New Roman"/>
+                <w:sz w:val="26"/>
+                <w:szCs w:val="26"/>
+              </w:rPr>
+              <w:t>- Kết quả thống kê được kiểm tra và đối chiếu với dữ liệu ban đầu.</w:t>
             </w:r>
           </w:p>
         </w:tc>
@@ -2980,6 +2915,80 @@
                 <w:szCs w:val="26"/>
               </w:rPr>
             </w:pPr>
+            <w:r>
+              <w:rPr>
+                <w:rFonts w:ascii="Times New Roman" w:eastAsia="Times New Roman" w:hAnsi="Times New Roman" w:cs="Times New Roman"/>
+                <w:sz w:val="26"/>
+                <w:szCs w:val="26"/>
+              </w:rPr>
+              <w:t xml:space="preserve">- Rà soát và hoàn thiện các hồ sơ, danh sách học sinh </w:t>
+            </w:r>
+            <w:r>
+              <w:rPr>
+                <w:rFonts w:ascii="Times New Roman" w:eastAsia="Times New Roman" w:hAnsi="Times New Roman" w:cs="Times New Roman"/>
+                <w:sz w:val="26"/>
+                <w:szCs w:val="26"/>
+              </w:rPr>
+              <w:lastRenderedPageBreak/>
+              <w:t>phục vụ công tác quản lý đầu năm học.</w:t>
+            </w:r>
+          </w:p>
+          <w:p>
+            <w:pPr>
+              <w:spacing w:line="432" w:lineRule="auto"/>
+              <w:jc w:val="both"/>
+              <w:rPr>
+                <w:rFonts w:ascii="Times New Roman" w:eastAsia="Times New Roman" w:hAnsi="Times New Roman" w:cs="Times New Roman"/>
+                <w:sz w:val="26"/>
+                <w:szCs w:val="26"/>
+              </w:rPr>
+            </w:pPr>
+            <w:r>
+              <w:rPr>
+                <w:rFonts w:ascii="Times New Roman" w:eastAsia="Times New Roman" w:hAnsi="Times New Roman" w:cs="Times New Roman"/>
+                <w:sz w:val="26"/>
+                <w:szCs w:val="26"/>
+              </w:rPr>
+              <w:t>- Hỗ trợ tổng hợp và kiểm tra một số số liệu từ năm học trước nhằm phục vụ công tác chuẩn bị, mua sắm đồ dùng dạy học cho năm học mới.</w:t>
+            </w:r>
+          </w:p>
+          <w:p>
+            <w:pPr>
+              <w:spacing w:line="432" w:lineRule="auto"/>
+              <w:jc w:val="both"/>
+              <w:rPr>
+                <w:rFonts w:ascii="Times New Roman" w:eastAsia="Times New Roman" w:hAnsi="Times New Roman" w:cs="Times New Roman"/>
+                <w:sz w:val="26"/>
+                <w:szCs w:val="26"/>
+              </w:rPr>
+            </w:pPr>
+            <w:r>
+              <w:rPr>
+                <w:rFonts w:ascii="Times New Roman" w:eastAsia="Times New Roman" w:hAnsi="Times New Roman" w:cs="Times New Roman"/>
+                <w:sz w:val="26"/>
+                <w:szCs w:val="26"/>
+              </w:rPr>
+              <w:t>- Hỗ trợ cập nhật, kiểm tra và sắp xếp thông tin học sinh trong quá trình ổn định năm học mới.</w:t>
+            </w:r>
+          </w:p>
+          <w:p>
+            <w:pPr>
+              <w:spacing w:line="432" w:lineRule="auto"/>
+              <w:jc w:val="both"/>
+              <w:rPr>
+                <w:rFonts w:ascii="Times New Roman" w:eastAsia="Times New Roman" w:hAnsi="Times New Roman" w:cs="Times New Roman"/>
+                <w:sz w:val="26"/>
+                <w:szCs w:val="26"/>
+              </w:rPr>
+            </w:pPr>
+            <w:r>
+              <w:rPr>
+                <w:rFonts w:ascii="Times New Roman" w:eastAsia="Times New Roman" w:hAnsi="Times New Roman" w:cs="Times New Roman"/>
+                <w:sz w:val="26"/>
+                <w:szCs w:val="26"/>
+              </w:rPr>
+              <w:t>- Tổng hợp các công việc đã thực hiện và tiếp tục hoàn thiện báo cáo thực tập.</w:t>
+            </w:r>
           </w:p>
         </w:tc>
         <w:tc>
@@ -3009,6 +3018,81 @@
                 <w:szCs w:val="26"/>
               </w:rPr>
             </w:pPr>
+            <w:r>
+              <w:rPr>
+                <w:rFonts w:ascii="Times New Roman" w:eastAsia="Times New Roman" w:hAnsi="Times New Roman" w:cs="Times New Roman"/>
+                <w:sz w:val="26"/>
+                <w:szCs w:val="26"/>
+              </w:rPr>
+              <w:lastRenderedPageBreak/>
+              <w:t xml:space="preserve">- Hoàn thành việc rà soát và sắp xếp các hồ sơ, danh </w:t>
+            </w:r>
+            <w:r>
+              <w:rPr>
+                <w:rFonts w:ascii="Times New Roman" w:eastAsia="Times New Roman" w:hAnsi="Times New Roman" w:cs="Times New Roman"/>
+                <w:sz w:val="26"/>
+                <w:szCs w:val="26"/>
+              </w:rPr>
+              <w:lastRenderedPageBreak/>
+              <w:t>sách được phân công.</w:t>
+            </w:r>
+          </w:p>
+          <w:p>
+            <w:pPr>
+              <w:spacing w:line="432" w:lineRule="auto"/>
+              <w:jc w:val="both"/>
+              <w:rPr>
+                <w:rFonts w:ascii="Times New Roman" w:eastAsia="Times New Roman" w:hAnsi="Times New Roman" w:cs="Times New Roman"/>
+                <w:sz w:val="26"/>
+                <w:szCs w:val="26"/>
+              </w:rPr>
+            </w:pPr>
+            <w:r>
+              <w:rPr>
+                <w:rFonts w:ascii="Times New Roman" w:eastAsia="Times New Roman" w:hAnsi="Times New Roman" w:cs="Times New Roman"/>
+                <w:sz w:val="26"/>
+                <w:szCs w:val="26"/>
+              </w:rPr>
+              <w:t>- Thực hiện được việc tổng hợp, kiểm tra số liệu phục vụ một số công việc đầu năm học.</w:t>
+            </w:r>
+          </w:p>
+          <w:p>
+            <w:pPr>
+              <w:spacing w:line="432" w:lineRule="auto"/>
+              <w:jc w:val="both"/>
+              <w:rPr>
+                <w:rFonts w:ascii="Times New Roman" w:eastAsia="Times New Roman" w:hAnsi="Times New Roman" w:cs="Times New Roman"/>
+                <w:sz w:val="26"/>
+                <w:szCs w:val="26"/>
+              </w:rPr>
+            </w:pPr>
+            <w:r>
+              <w:rPr>
+                <w:rFonts w:ascii="Times New Roman" w:eastAsia="Times New Roman" w:hAnsi="Times New Roman" w:cs="Times New Roman"/>
+                <w:sz w:val="26"/>
+                <w:szCs w:val="26"/>
+              </w:rPr>
+              <w:t>- Nắm được thêm quy trình xử lý và tổng hợp thông tin phục vụ công tác hành chính tại Văn phòng.</w:t>
+            </w:r>
+          </w:p>
+          <w:p>
+            <w:pPr>
+              <w:spacing w:line="432" w:lineRule="auto"/>
+              <w:jc w:val="both"/>
+              <w:rPr>
+                <w:rFonts w:ascii="Times New Roman" w:eastAsia="Times New Roman" w:hAnsi="Times New Roman" w:cs="Times New Roman"/>
+                <w:sz w:val="26"/>
+                <w:szCs w:val="26"/>
+              </w:rPr>
+            </w:pPr>
+            <w:r>
+              <w:rPr>
+                <w:rFonts w:ascii="Times New Roman" w:eastAsia="Times New Roman" w:hAnsi="Times New Roman" w:cs="Times New Roman"/>
+                <w:sz w:val="26"/>
+                <w:szCs w:val="26"/>
+              </w:rPr>
+              <w:t>- Tổng hợp được các công việc đã thực hiện trong quá trình thực tập và tiếp tục hoàn thiện báo cáo.</w:t>
+            </w:r>
           </w:p>
         </w:tc>
         <w:tc>
@@ -3075,7 +3159,6 @@
                 <w:sz w:val="26"/>
                 <w:szCs w:val="26"/>
               </w:rPr>
-              <w:lastRenderedPageBreak/>
               <w:t>(Từ 14/09/2026 đến 20/09/2026)</w:t>
             </w:r>
           </w:p>
@@ -3245,6 +3328,7 @@
           <w:sz w:val="26"/>
           <w:szCs w:val="26"/>
         </w:rPr>
+        <w:lastRenderedPageBreak/>
         <w:tab/>
       </w:r>
     </w:p>
@@ -4403,6 +4487,7 @@
   <w:style w:type="character" w:default="1" w:styleId="DefaultParagraphFont">
     <w:name w:val="Default Paragraph Font"/>
     <w:uiPriority w:val="1"/>
+    <w:semiHidden/>
     <w:unhideWhenUsed/>
   </w:style>
   <w:style w:type="table" w:default="1" w:styleId="TableNormal">

</xml_diff>